<commit_message>
Add standard three-line table rule (v1.3)
</commit_message>
<xml_diff>
--- a/00_交付文档.docx
+++ b/00_交付文档.docx
@@ -77,7 +77,7 @@
           <w:sz w:val="21"/>
           <w:szCs w:val="21"/>
         </w:rPr>
-        <w:t xml:space="preserve">版本 1.2　|　2026-10-26</w:t>
+        <w:t xml:space="preserve">版本 1.3　|　2026-10-26</w:t>
       </w:r>
     </w:p>
     <w:p>
@@ -115,10 +115,10 @@
       <w:r>
         <w:rPr>
           <w:color w:val="595959"/>
-          <w:sz w:val="20"/>
-          <w:szCs w:val="20"/>
-        </w:rPr>
-        <w:t xml:space="preserve">1.2 新增：冷启动入口、首次起草、全文范例、报告生成器、人工介入、污染检查</w:t>
+          <w:sz w:val="19"/>
+          <w:szCs w:val="19"/>
+        </w:rPr>
+        <w:t xml:space="preserve">1.3 新增：标准三线表硬性规则 + 生成器审计；1.2 新增：冷启动/起草/全文范例/生成器/人工闸门/污染检查</w:t>
       </w:r>
     </w:p>
     <w:p>
@@ -3473,6 +3473,26 @@
     </w:p>
     <w:p>
       <w:pPr>
+        <w:pStyle w:val="ListParagraph"/>
+        <w:spacing w:after="30"/>
+        <w:ind w:left="420" w:hanging="210"/>
+      </w:pPr>
+      <w:r>
+        <w:t xml:space="preserve">• </w:t>
+      </w:r>
+      <w:r>
+        <w:rPr>
+          <w:b/>
+          <w:bCs/>
+        </w:rPr>
+        <w:t xml:space="preserve">表格硬性</w:t>
+      </w:r>
+      <w:r>
+        <w:t xml:space="preserve">：所有数据表（条件表、结果表、峰归属表、汇总表）一律标准三线表——顶/底 1.5 pt、表头线 0.75 pt、无竖线/左右边框/其他内横线；表头加粗、单位在表头；不要用 Excel 默认网格、全框表、斑马纹。</w:t>
+      </w:r>
+    </w:p>
+    <w:p>
+      <w:pPr>
         <w:pBdr>
           <w:bottom w:val="single" w:sz="6" w:space="6" w:color="999999"/>
         </w:pBdr>
@@ -6818,7 +6838,7 @@
         <w:ind w:left="420" w:hanging="300"/>
       </w:pPr>
       <w:r>
-        <w:t xml:space="preserve">9. 图号/表号/正文/图注/Excel 一致吗？</w:t>
+        <w:t xml:space="preserve">9. 图号/表号/正文/图注/Excel 一致吗？所有表格都是标准三线表吗？</w:t>
       </w:r>
     </w:p>
     <w:p>

</xml_diff>